<commit_message>
feat: add securities research methods and reader-focused templates
</commit_message>
<xml_diff>
--- a/src/briefloop/template_assets/stock-research-zh-t1.docx
+++ b/src/briefloop/template_assets/stock-research-zh-t1.docx
@@ -49,160 +49,6 @@
       </w:r>
     </w:p>
     <w:p/>
-    <w:tbl>
-      <w:tblPr>
-        <w:tblW w:type="auto" w:w="0"/>
-        <w:tblLook w:firstColumn="1" w:firstRow="1" w:lastColumn="0" w:lastRow="0" w:noHBand="0" w:noVBand="1" w:val="04A0"/>
-        <w:tblBorders>
-          <w:top w:val="single" w:sz="8" w:color="1E2320"/>
-          <w:bottom w:val="single" w:sz="8" w:color="1E2320"/>
-          <w:left w:val="none" w:sz="0" w:color="1E2320"/>
-          <w:right w:val="none" w:sz="0" w:color="1E2320"/>
-          <w:insideH w:val="single" w:sz="4" w:color="1E2320"/>
-          <w:insideV w:val="none" w:sz="0" w:color="1E2320"/>
-        </w:tblBorders>
-      </w:tblPr>
-      <w:tblGrid>
-        <w:gridCol w:w="4320"/>
-        <w:gridCol w:w="4320"/>
-      </w:tblGrid>
-      <w:tr>
-        <w:tc>
-          <w:tcPr>
-            <w:tcW w:type="dxa" w:w="4320"/>
-          </w:tcPr>
-          <w:p>
-            <w:r>
-              <w:rPr>
-                <w:rFonts w:ascii="Arial" w:hAnsi="Arial" w:eastAsia="宋体"/>
-                <w:b/>
-                <w:color w:val="1E2320"/>
-                <w:sz w:val="21"/>
-              </w:rPr>
-              <w:t>投资评级：</w:t>
-            </w:r>
-          </w:p>
-        </w:tc>
-        <w:tc>
-          <w:tcPr>
-            <w:tcW w:type="dxa" w:w="4320"/>
-          </w:tcPr>
-          <w:p>
-            <w:r>
-              <w:rPr>
-                <w:rFonts w:ascii="Arial" w:hAnsi="Arial" w:eastAsia="宋体"/>
-                <w:b w:val="0"/>
-                <w:color w:val="1E2320"/>
-                <w:sz w:val="21"/>
-              </w:rPr>
-              <w:t>待定（首次覆盖时更新）</w:t>
-            </w:r>
-          </w:p>
-        </w:tc>
-      </w:tr>
-      <w:tr>
-        <w:tc>
-          <w:tcPr>
-            <w:tcW w:type="dxa" w:w="4320"/>
-          </w:tcPr>
-          <w:p>
-            <w:r>
-              <w:rPr>
-                <w:rFonts w:ascii="Arial" w:hAnsi="Arial" w:eastAsia="宋体"/>
-                <w:b/>
-                <w:color w:val="1E2320"/>
-                <w:sz w:val="21"/>
-              </w:rPr>
-              <w:t>目标价：</w:t>
-            </w:r>
-          </w:p>
-        </w:tc>
-        <w:tc>
-          <w:tcPr>
-            <w:tcW w:type="dxa" w:w="4320"/>
-          </w:tcPr>
-          <w:p>
-            <w:r>
-              <w:rPr>
-                <w:rFonts w:ascii="Arial" w:hAnsi="Arial" w:eastAsia="宋体"/>
-                <w:b w:val="0"/>
-                <w:color w:val="1E2320"/>
-                <w:sz w:val="21"/>
-              </w:rPr>
-              <w:t>＿＿＿＿</w:t>
-            </w:r>
-          </w:p>
-        </w:tc>
-      </w:tr>
-      <w:tr>
-        <w:tc>
-          <w:tcPr>
-            <w:tcW w:type="dxa" w:w="4320"/>
-          </w:tcPr>
-          <w:p>
-            <w:r>
-              <w:rPr>
-                <w:rFonts w:ascii="Arial" w:hAnsi="Arial" w:eastAsia="宋体"/>
-                <w:b/>
-                <w:color w:val="1E2320"/>
-                <w:sz w:val="21"/>
-              </w:rPr>
-              <w:t>现价：</w:t>
-            </w:r>
-          </w:p>
-        </w:tc>
-        <w:tc>
-          <w:tcPr>
-            <w:tcW w:type="dxa" w:w="4320"/>
-          </w:tcPr>
-          <w:p>
-            <w:r>
-              <w:rPr>
-                <w:rFonts w:ascii="Arial" w:hAnsi="Arial" w:eastAsia="宋体"/>
-                <w:b w:val="0"/>
-                <w:color w:val="1E2320"/>
-                <w:sz w:val="21"/>
-              </w:rPr>
-              <w:t>＿＿＿＿</w:t>
-            </w:r>
-          </w:p>
-        </w:tc>
-      </w:tr>
-      <w:tr>
-        <w:tc>
-          <w:tcPr>
-            <w:tcW w:type="dxa" w:w="4320"/>
-          </w:tcPr>
-          <w:p>
-            <w:r>
-              <w:rPr>
-                <w:rFonts w:ascii="Arial" w:hAnsi="Arial" w:eastAsia="宋体"/>
-                <w:b/>
-                <w:color w:val="1E2320"/>
-                <w:sz w:val="21"/>
-              </w:rPr>
-              <w:t>报告日期：</w:t>
-            </w:r>
-          </w:p>
-        </w:tc>
-        <w:tc>
-          <w:tcPr>
-            <w:tcW w:type="dxa" w:w="4320"/>
-          </w:tcPr>
-          <w:p>
-            <w:r>
-              <w:rPr>
-                <w:rFonts w:ascii="Arial" w:hAnsi="Arial" w:eastAsia="宋体"/>
-                <w:b w:val="0"/>
-                <w:color w:val="1E2320"/>
-                <w:sz w:val="21"/>
-              </w:rPr>
-              <w:t>{{report_date}}</w:t>
-            </w:r>
-          </w:p>
-        </w:tc>
-      </w:tr>
-    </w:tbl>
     <w:p>
       <w:r>
         <w:br w:type="page"/>
@@ -262,20 +108,6 @@
           <w:sz w:val="30"/>
         </w:rPr>
         <w:t>风险提示</w:t>
-      </w:r>
-    </w:p>
-    <w:p>
-      <w:pPr>
-        <w:pStyle w:val="Heading1"/>
-      </w:pPr>
-      <w:r>
-        <w:rPr>
-          <w:rFonts w:ascii="Arial" w:hAnsi="Arial" w:eastAsia="黑体"/>
-          <w:b/>
-          <w:color w:val="006838"/>
-          <w:sz w:val="30"/>
-        </w:rPr>
-        <w:t>免责声明</w:t>
       </w:r>
     </w:p>
     <w:p>

</xml_diff>